<commit_message>
Memoria modificada explicando specs
</commit_message>
<xml_diff>
--- a/favila.docx
+++ b/favila.docx
@@ -15502,6 +15502,510 @@
           </w14:textFill>
         </w:rPr>
         <w:t>Filtrar por un empleado y un mes y abrir el mapa de un fichaje.</w:t>
+      </w:r>
+    </w:p>
+    <w:p>
+      <w:pPr>
+        <w:pStyle w:val="Cuerpo"/>
+        <w:spacing w:after="40" w:line="320" w:lineRule="auto"/>
+        <w:ind w:left="708" w:firstLine="0"/>
+        <w:jc w:val="both"/>
+      </w:pPr>
+      <w:r>
+        <w:rPr>
+          <w:rStyle w:val="Ninguno"/>
+          <w:rFonts w:ascii="Arial" w:hAnsi="Arial" w:hint="default"/>
+          <w:b w:val="1"/>
+          <w:bCs w:val="1"/>
+          <w:outline w:val="0"/>
+          <w:color w:val="000000"/>
+          <w:u w:color="000000"/>
+          <w:rtl w:val="0"/>
+          <w:lang w:val="es-ES_tradnl"/>
+          <w14:textFill>
+            <w14:solidFill>
+              <w14:srgbClr w14:val="000000"/>
+            </w14:solidFill>
+          </w14:textFill>
+        </w:rPr>
+        <w:t xml:space="preserve">R05F04 </w:t>
+      </w:r>
+      <w:r>
+        <w:rPr>
+          <w:rStyle w:val="Ninguno"/>
+          <w:rFonts w:ascii="Arial" w:hAnsi="Arial" w:hint="default"/>
+          <w:b w:val="1"/>
+          <w:bCs w:val="1"/>
+          <w:outline w:val="0"/>
+          <w:color w:val="000000"/>
+          <w:u w:color="000000"/>
+          <w:rtl w:val="0"/>
+          <w:lang w:val="es-ES_tradnl"/>
+          <w14:textFill>
+            <w14:solidFill>
+              <w14:srgbClr w14:val="000000"/>
+            </w14:solidFill>
+          </w14:textFill>
+        </w:rPr>
+        <w:t xml:space="preserve">– </w:t>
+      </w:r>
+      <w:r>
+        <w:rPr>
+          <w:rStyle w:val="Ninguno"/>
+          <w:rFonts w:ascii="Arial" w:hAnsi="Arial" w:hint="default"/>
+          <w:outline w:val="0"/>
+          <w:color w:val="000000"/>
+          <w:u w:color="000000"/>
+          <w:rtl w:val="0"/>
+          <w:lang w:val="es-ES_tradnl"/>
+          <w14:textFill>
+            <w14:solidFill>
+              <w14:srgbClr w14:val="000000"/>
+            </w14:solidFill>
+          </w14:textFill>
+        </w:rPr>
+        <w:t xml:space="preserve">Cada fichaje se valida contra la ubicación del cliente del turno y queda marcado como dentro, dudoso, fuera o sin referencia, sin bloquear nunca el fichaje.</w:t>
+      </w:r>
+    </w:p>
+    <w:p>
+      <w:pPr>
+        <w:pStyle w:val="Cuerpo"/>
+        <w:spacing w:after="40" w:line="320" w:lineRule="auto"/>
+        <w:ind w:left="1416" w:firstLine="0"/>
+        <w:jc w:val="both"/>
+      </w:pPr>
+      <w:r>
+        <w:rPr>
+          <w:rStyle w:val="Ninguno"/>
+          <w:rFonts w:ascii="Arial" w:hAnsi="Arial" w:hint="default"/>
+          <w:b w:val="1"/>
+          <w:bCs w:val="1"/>
+          <w:outline w:val="0"/>
+          <w:color w:val="000000"/>
+          <w:u w:color="000000"/>
+          <w:rtl w:val="0"/>
+          <w:lang w:val="es-ES_tradnl"/>
+          <w14:textFill>
+            <w14:solidFill>
+              <w14:srgbClr w14:val="000000"/>
+            </w14:solidFill>
+          </w14:textFill>
+        </w:rPr>
+        <w:t xml:space="preserve">R05F04T01 </w:t>
+      </w:r>
+      <w:r>
+        <w:rPr>
+          <w:rStyle w:val="Ninguno"/>
+          <w:rFonts w:ascii="Arial" w:hAnsi="Arial" w:hint="default"/>
+          <w:b w:val="1"/>
+          <w:bCs w:val="1"/>
+          <w:outline w:val="0"/>
+          <w:color w:val="000000"/>
+          <w:u w:color="000000"/>
+          <w:rtl w:val="0"/>
+          <w:lang w:val="es-ES_tradnl"/>
+          <w14:textFill>
+            <w14:solidFill>
+              <w14:srgbClr w14:val="000000"/>
+            </w14:solidFill>
+          </w14:textFill>
+        </w:rPr>
+        <w:t xml:space="preserve">– </w:t>
+      </w:r>
+      <w:r>
+        <w:rPr>
+          <w:rStyle w:val="Ninguno"/>
+          <w:rFonts w:ascii="Arial" w:hAnsi="Arial" w:hint="default"/>
+          <w:outline w:val="0"/>
+          <w:color w:val="000000"/>
+          <w:u w:color="000000"/>
+          <w:rtl w:val="0"/>
+          <w:lang w:val="es-ES_tradnl"/>
+          <w14:textFill>
+            <w14:solidFill>
+              <w14:srgbClr w14:val="000000"/>
+            </w14:solidFill>
+          </w14:textFill>
+        </w:rPr>
+        <w:t xml:space="preserve">Implementar validarUbicacion con radio por cliente (150 m por defecto), margen por la precisión del GPS y tope de 100 m de precisión, y guardar el resultado en cada punto del fichaje.</w:t>
+      </w:r>
+    </w:p>
+    <w:p>
+      <w:pPr>
+        <w:pStyle w:val="Cuerpo"/>
+        <w:spacing w:after="40" w:line="320" w:lineRule="auto"/>
+        <w:ind w:left="2124" w:firstLine="0"/>
+        <w:jc w:val="both"/>
+      </w:pPr>
+      <w:r>
+        <w:rPr>
+          <w:rStyle w:val="Ninguno"/>
+          <w:rFonts w:ascii="Arial" w:hAnsi="Arial" w:hint="default"/>
+          <w:b w:val="1"/>
+          <w:bCs w:val="1"/>
+          <w:outline w:val="0"/>
+          <w:color w:val="000000"/>
+          <w:u w:color="000000"/>
+          <w:rtl w:val="0"/>
+          <w:lang w:val="es-ES_tradnl"/>
+          <w14:textFill>
+            <w14:solidFill>
+              <w14:srgbClr w14:val="000000"/>
+            </w14:solidFill>
+          </w14:textFill>
+        </w:rPr>
+        <w:t xml:space="preserve">R05F04T01P01 </w:t>
+      </w:r>
+      <w:r>
+        <w:rPr>
+          <w:rStyle w:val="Ninguno"/>
+          <w:rFonts w:ascii="Arial" w:hAnsi="Arial" w:hint="default"/>
+          <w:b w:val="1"/>
+          <w:bCs w:val="1"/>
+          <w:outline w:val="0"/>
+          <w:color w:val="000000"/>
+          <w:u w:color="000000"/>
+          <w:rtl w:val="0"/>
+          <w:lang w:val="es-ES_tradnl"/>
+          <w14:textFill>
+            <w14:solidFill>
+              <w14:srgbClr w14:val="000000"/>
+            </w14:solidFill>
+          </w14:textFill>
+        </w:rPr>
+        <w:t xml:space="preserve">– </w:t>
+      </w:r>
+      <w:r>
+        <w:rPr>
+          <w:rStyle w:val="Ninguno"/>
+          <w:rFonts w:ascii="Arial" w:hAnsi="Arial" w:hint="default"/>
+          <w:outline w:val="0"/>
+          <w:color w:val="000000"/>
+          <w:u w:color="000000"/>
+          <w:rtl w:val="0"/>
+          <w:lang w:val="es-ES_tradnl"/>
+          <w14:textFill>
+            <w14:solidFill>
+              <w14:srgbClr w14:val="000000"/>
+            </w14:solidFill>
+          </w14:textFill>
+        </w:rPr>
+        <w:t xml:space="preserve">Ejecutar los tests de casos límite: 149 m con precisión de 5 m es dentro; 151 m con 5 m, dudoso; 160 m con 5 m, fuera; 10 m con 300 m de precisión, dudoso.</w:t>
+      </w:r>
+    </w:p>
+    <w:p>
+      <w:pPr>
+        <w:pStyle w:val="Cuerpo"/>
+        <w:spacing w:after="40" w:line="320" w:lineRule="auto"/>
+        <w:ind w:left="1416" w:firstLine="0"/>
+        <w:jc w:val="both"/>
+      </w:pPr>
+      <w:r>
+        <w:rPr>
+          <w:rStyle w:val="Ninguno"/>
+          <w:rFonts w:ascii="Arial" w:hAnsi="Arial" w:hint="default"/>
+          <w:b w:val="1"/>
+          <w:bCs w:val="1"/>
+          <w:outline w:val="0"/>
+          <w:color w:val="000000"/>
+          <w:u w:color="000000"/>
+          <w:rtl w:val="0"/>
+          <w:lang w:val="es-ES_tradnl"/>
+          <w14:textFill>
+            <w14:solidFill>
+              <w14:srgbClr w14:val="000000"/>
+            </w14:solidFill>
+          </w14:textFill>
+        </w:rPr>
+        <w:t xml:space="preserve">R05F04T02 </w:t>
+      </w:r>
+      <w:r>
+        <w:rPr>
+          <w:rStyle w:val="Ninguno"/>
+          <w:rFonts w:ascii="Arial" w:hAnsi="Arial" w:hint="default"/>
+          <w:b w:val="1"/>
+          <w:bCs w:val="1"/>
+          <w:outline w:val="0"/>
+          <w:color w:val="000000"/>
+          <w:u w:color="000000"/>
+          <w:rtl w:val="0"/>
+          <w:lang w:val="es-ES_tradnl"/>
+          <w14:textFill>
+            <w14:solidFill>
+              <w14:srgbClr w14:val="000000"/>
+            </w14:solidFill>
+          </w14:textFill>
+        </w:rPr>
+        <w:t xml:space="preserve">– </w:t>
+      </w:r>
+      <w:r>
+        <w:rPr>
+          <w:rStyle w:val="Ninguno"/>
+          <w:rFonts w:ascii="Arial" w:hAnsi="Arial" w:hint="default"/>
+          <w:outline w:val="0"/>
+          <w:color w:val="000000"/>
+          <w:u w:color="000000"/>
+          <w:rtl w:val="0"/>
+          <w:lang w:val="es-ES_tradnl"/>
+          <w14:textFill>
+            <w14:solidFill>
+              <w14:srgbClr w14:val="000000"/>
+            </w14:solidFill>
+          </w14:textFill>
+        </w:rPr>
+        <w:t xml:space="preserve">Obtener el cliente de referencia a partir de los turnos y las coberturas del día; los turnos de furgoneta y los clientes sin coordenadas dan sin referencia.</w:t>
+      </w:r>
+    </w:p>
+    <w:p>
+      <w:pPr>
+        <w:pStyle w:val="Cuerpo"/>
+        <w:spacing w:after="40" w:line="320" w:lineRule="auto"/>
+        <w:ind w:left="2124" w:firstLine="0"/>
+        <w:jc w:val="both"/>
+      </w:pPr>
+      <w:r>
+        <w:rPr>
+          <w:rStyle w:val="Ninguno"/>
+          <w:rFonts w:ascii="Arial" w:hAnsi="Arial" w:hint="default"/>
+          <w:b w:val="1"/>
+          <w:bCs w:val="1"/>
+          <w:outline w:val="0"/>
+          <w:color w:val="000000"/>
+          <w:u w:color="000000"/>
+          <w:rtl w:val="0"/>
+          <w:lang w:val="es-ES_tradnl"/>
+          <w14:textFill>
+            <w14:solidFill>
+              <w14:srgbClr w14:val="000000"/>
+            </w14:solidFill>
+          </w14:textFill>
+        </w:rPr>
+        <w:t xml:space="preserve">R05F04T02P01 </w:t>
+      </w:r>
+      <w:r>
+        <w:rPr>
+          <w:rStyle w:val="Ninguno"/>
+          <w:rFonts w:ascii="Arial" w:hAnsi="Arial" w:hint="default"/>
+          <w:b w:val="1"/>
+          <w:bCs w:val="1"/>
+          <w:outline w:val="0"/>
+          <w:color w:val="000000"/>
+          <w:u w:color="000000"/>
+          <w:rtl w:val="0"/>
+          <w:lang w:val="es-ES_tradnl"/>
+          <w14:textFill>
+            <w14:solidFill>
+              <w14:srgbClr w14:val="000000"/>
+            </w14:solidFill>
+          </w14:textFill>
+        </w:rPr>
+        <w:t xml:space="preserve">– </w:t>
+      </w:r>
+      <w:r>
+        <w:rPr>
+          <w:rStyle w:val="Ninguno"/>
+          <w:rFonts w:ascii="Arial" w:hAnsi="Arial" w:hint="default"/>
+          <w:outline w:val="0"/>
+          <w:color w:val="000000"/>
+          <w:u w:color="000000"/>
+          <w:rtl w:val="0"/>
+          <w:lang w:val="es-ES_tradnl"/>
+          <w14:textFill>
+            <w14:solidFill>
+              <w14:srgbClr w14:val="000000"/>
+            </w14:solidFill>
+          </w14:textFill>
+        </w:rPr>
+        <w:t xml:space="preserve">Fichar con un turno de furgoneta y comprobar que el estado es sin referencia y que el fichaje se guarda.</w:t>
+      </w:r>
+    </w:p>
+    <w:p>
+      <w:pPr>
+        <w:pStyle w:val="Cuerpo"/>
+        <w:spacing w:after="40" w:line="320" w:lineRule="auto"/>
+        <w:ind w:left="708" w:firstLine="0"/>
+        <w:jc w:val="both"/>
+      </w:pPr>
+      <w:r>
+        <w:rPr>
+          <w:rStyle w:val="Ninguno"/>
+          <w:rFonts w:ascii="Arial" w:hAnsi="Arial" w:hint="default"/>
+          <w:b w:val="1"/>
+          <w:bCs w:val="1"/>
+          <w:outline w:val="0"/>
+          <w:color w:val="000000"/>
+          <w:u w:color="000000"/>
+          <w:rtl w:val="0"/>
+          <w:lang w:val="es-ES_tradnl"/>
+          <w14:textFill>
+            <w14:solidFill>
+              <w14:srgbClr w14:val="000000"/>
+            </w14:solidFill>
+          </w14:textFill>
+        </w:rPr>
+        <w:t xml:space="preserve">R05F05 </w:t>
+      </w:r>
+      <w:r>
+        <w:rPr>
+          <w:rStyle w:val="Ninguno"/>
+          <w:rFonts w:ascii="Arial" w:hAnsi="Arial" w:hint="default"/>
+          <w:b w:val="1"/>
+          <w:bCs w:val="1"/>
+          <w:outline w:val="0"/>
+          <w:color w:val="000000"/>
+          <w:u w:color="000000"/>
+          <w:rtl w:val="0"/>
+          <w:lang w:val="es-ES_tradnl"/>
+          <w14:textFill>
+            <w14:solidFill>
+              <w14:srgbClr w14:val="000000"/>
+            </w14:solidFill>
+          </w14:textFill>
+        </w:rPr>
+        <w:t xml:space="preserve">– </w:t>
+      </w:r>
+      <w:r>
+        <w:rPr>
+          <w:rStyle w:val="Ninguno"/>
+          <w:rFonts w:ascii="Arial" w:hAnsi="Arial" w:hint="default"/>
+          <w:outline w:val="0"/>
+          <w:color w:val="000000"/>
+          <w:u w:color="000000"/>
+          <w:rtl w:val="0"/>
+          <w:lang w:val="es-ES_tradnl"/>
+          <w14:textFill>
+            <w14:solidFill>
+              <w14:srgbClr w14:val="000000"/>
+            </w14:solidFill>
+          </w14:textFill>
+        </w:rPr>
+        <w:t xml:space="preserve">Los fichajes con indicios de ubicación falsa quedan marcados con un nivel de sospecha y sus motivos.</w:t>
+      </w:r>
+    </w:p>
+    <w:p>
+      <w:pPr>
+        <w:pStyle w:val="Cuerpo"/>
+        <w:spacing w:after="40" w:line="320" w:lineRule="auto"/>
+        <w:ind w:left="1416" w:firstLine="0"/>
+        <w:jc w:val="both"/>
+      </w:pPr>
+      <w:r>
+        <w:rPr>
+          <w:rStyle w:val="Ninguno"/>
+          <w:rFonts w:ascii="Arial" w:hAnsi="Arial" w:hint="default"/>
+          <w:b w:val="1"/>
+          <w:bCs w:val="1"/>
+          <w:outline w:val="0"/>
+          <w:color w:val="000000"/>
+          <w:u w:color="000000"/>
+          <w:rtl w:val="0"/>
+          <w:lang w:val="es-ES_tradnl"/>
+          <w14:textFill>
+            <w14:solidFill>
+              <w14:srgbClr w14:val="000000"/>
+            </w14:solidFill>
+          </w14:textFill>
+        </w:rPr>
+        <w:t xml:space="preserve">R05F05T01 </w:t>
+      </w:r>
+      <w:r>
+        <w:rPr>
+          <w:rStyle w:val="Ninguno"/>
+          <w:rFonts w:ascii="Arial" w:hAnsi="Arial" w:hint="default"/>
+          <w:b w:val="1"/>
+          <w:bCs w:val="1"/>
+          <w:outline w:val="0"/>
+          <w:color w:val="000000"/>
+          <w:u w:color="000000"/>
+          <w:rtl w:val="0"/>
+          <w:lang w:val="es-ES_tradnl"/>
+          <w14:textFill>
+            <w14:solidFill>
+              <w14:srgbClr w14:val="000000"/>
+            </w14:solidFill>
+          </w14:textFill>
+        </w:rPr>
+        <w:t xml:space="preserve">– </w:t>
+      </w:r>
+      <w:r>
+        <w:rPr>
+          <w:rStyle w:val="Ninguno"/>
+          <w:rFonts w:ascii="Arial" w:hAnsi="Arial" w:hint="default"/>
+          <w:outline w:val="0"/>
+          <w:color w:val="000000"/>
+          <w:u w:color="000000"/>
+          <w:rtl w:val="0"/>
+          <w:lang w:val="es-ES_tradnl"/>
+          <w14:textFill>
+            <w14:solidFill>
+              <w14:srgbClr w14:val="000000"/>
+            </w14:solidFill>
+          </w14:textFill>
+        </w:rPr>
+        <w:t xml:space="preserve">Implementar deteccionUbicacionFalsa con las señales de viaje imposible, posición antigua, coordenadas idénticas, precisión artificial y cambio de dispositivo.</w:t>
+      </w:r>
+    </w:p>
+    <w:p>
+      <w:pPr>
+        <w:pStyle w:val="Cuerpo"/>
+        <w:spacing w:after="40" w:line="320" w:lineRule="auto"/>
+        <w:ind w:left="2124" w:firstLine="0"/>
+        <w:jc w:val="both"/>
+      </w:pPr>
+      <w:r>
+        <w:rPr>
+          <w:rStyle w:val="Ninguno"/>
+          <w:rFonts w:ascii="Arial" w:hAnsi="Arial" w:hint="default"/>
+          <w:b w:val="1"/>
+          <w:bCs w:val="1"/>
+          <w:outline w:val="0"/>
+          <w:color w:val="000000"/>
+          <w:u w:color="000000"/>
+          <w:rtl w:val="0"/>
+          <w:lang w:val="es-ES_tradnl"/>
+          <w14:textFill>
+            <w14:solidFill>
+              <w14:srgbClr w14:val="000000"/>
+            </w14:solidFill>
+          </w14:textFill>
+        </w:rPr>
+        <w:t xml:space="preserve">R05F05T01P01 </w:t>
+      </w:r>
+      <w:r>
+        <w:rPr>
+          <w:rStyle w:val="Ninguno"/>
+          <w:rFonts w:ascii="Arial" w:hAnsi="Arial" w:hint="default"/>
+          <w:b w:val="1"/>
+          <w:bCs w:val="1"/>
+          <w:outline w:val="0"/>
+          <w:color w:val="000000"/>
+          <w:u w:color="000000"/>
+          <w:rtl w:val="0"/>
+          <w:lang w:val="es-ES_tradnl"/>
+          <w14:textFill>
+            <w14:solidFill>
+              <w14:srgbClr w14:val="000000"/>
+            </w14:solidFill>
+          </w14:textFill>
+        </w:rPr>
+        <w:t xml:space="preserve">– </w:t>
+      </w:r>
+      <w:r>
+        <w:rPr>
+          <w:rStyle w:val="Ninguno"/>
+          <w:rFonts w:ascii="Arial" w:hAnsi="Arial" w:hint="default"/>
+          <w:outline w:val="0"/>
+          <w:color w:val="000000"/>
+          <w:u w:color="000000"/>
+          <w:rtl w:val="0"/>
+          <w:lang w:val="es-ES_tradnl"/>
+          <w14:textFill>
+            <w14:solidFill>
+              <w14:srgbClr w14:val="000000"/>
+            </w14:solidFill>
+          </w14:textFill>
+        </w:rPr>
+        <w:t xml:space="preserve">Ejecutar los tests con un viaje de 100 km en 10 minutos (sospecha alta) y con una posición de hace más de 60 s (sospecha baja).</w:t>
       </w:r>
     </w:p>
     <w:p>
@@ -26053,6 +26557,979 @@
           </w14:textFill>
         </w:rPr>
         <w:t>n exigen un motivo y guardan el valor anterior en el historial del fichaje. Los listados y exportaciones excluyen por defecto los anulados.</w:t>
+      </w:r>
+    </w:p>
+    <w:p>
+      <w:pPr>
+        <w:pStyle w:val="Cuerpo"/>
+        <w:keepNext w:val="1"/>
+        <w:spacing w:before="120" w:after="80" w:line="360" w:lineRule="auto"/>
+        <w:outlineLvl w:val="2"/>
+      </w:pPr>
+      <w:r>
+        <w:rPr>
+          <w:rStyle w:val="Ninguno"/>
+          <w:rFonts w:ascii="Arial" w:hAnsi="Arial"/>
+          <w:b w:val="1"/>
+          <w:bCs w:val="1"/>
+          <w:i w:val="1"/>
+          <w:iCs w:val="1"/>
+          <w:outline w:val="0"/>
+          <w:color w:val="000000"/>
+          <w:sz w:val="23"/>
+          <w:szCs w:val="23"/>
+          <w:u w:color="000000"/>
+          <w:rtl w:val="0"/>
+          <w:lang w:val="es-ES_tradnl"/>
+          <w14:textFill>
+            <w14:solidFill>
+              <w14:srgbClr w14:val="000000"/>
+            </w14:solidFill>
+          </w14:textFill>
+        </w:rPr>
+        <w:t>Validación del fichaje por la ubicación</w:t>
+      </w:r>
+    </w:p>
+    <w:p>
+      <w:pPr>
+        <w:pStyle w:val="Cuerpo"/>
+        <w:spacing w:line="360" w:lineRule="auto"/>
+        <w:jc w:val="both"/>
+      </w:pPr>
+      <w:r>
+        <w:rPr>
+          <w:rStyle w:val="Ninguno"/>
+          <w:rFonts w:ascii="Arial" w:hAnsi="Arial" w:hint="default"/>
+          <w:outline w:val="0"/>
+          <w:color w:val="000000"/>
+          <w:u w:color="000000"/>
+          <w:rtl w:val="0"/>
+          <w:lang w:val="es-ES_tradnl"/>
+          <w14:textFill>
+            <w14:solidFill>
+              <w14:srgbClr w14:val="000000"/>
+            </w14:solidFill>
+          </w14:textFill>
+        </w:rPr>
+        <w:t xml:space="preserve">El servidor compara la posición del móvil con la del cliente del turno del empleado y guarda el resultado en el propio fichaje. Nunca lo bloquea: el registro de jornada es una obligación legal (artículo 34.9 del Estatuto de los Trabajadores) y un fallo del GPS no puede impedir que el empleado fiche. Por eso el sistema marca y la administración decide. La ubicación se usa solo al fichar, de acuerdo con el artículo 90 de la LOPDGDD.</w:t>
+      </w:r>
+    </w:p>
+    <w:p>
+      <w:pPr>
+        <w:pStyle w:val="Cuerpo"/>
+        <w:spacing w:line="360" w:lineRule="auto"/>
+        <w:jc w:val="both"/>
+      </w:pPr>
+      <w:r>
+        <w:rPr>
+          <w:rStyle w:val="Ninguno"/>
+          <w:rFonts w:ascii="Arial" w:hAnsi="Arial" w:hint="default"/>
+          <w:outline w:val="0"/>
+          <w:color w:val="000000"/>
+          <w:u w:color="000000"/>
+          <w:rtl w:val="0"/>
+          <w:lang w:val="es-ES_tradnl"/>
+          <w14:textFill>
+            <w14:solidFill>
+              <w14:srgbClr w14:val="000000"/>
+            </w14:solidFill>
+          </w14:textFill>
+        </w:rPr>
+        <w:t xml:space="preserve">La especificación de esta función se redacta con la plantilla «cuando ocurre X, el sistema hará Y», y cada regla se comprueba con un test automático:</w:t>
+      </w:r>
+    </w:p>
+    <w:p>
+      <w:pPr>
+        <w:pStyle w:val="Cuerpo"/>
+        <w:tabs>
+          <w:tab w:val="left" w:pos="567"/>
+        </w:tabs>
+        <w:spacing w:after="60" w:line="330" w:lineRule="auto"/>
+        <w:ind w:left="567" w:hanging="283"/>
+        <w:jc w:val="both"/>
+      </w:pPr>
+      <w:r>
+        <w:rPr>
+          <w:rStyle w:val="Ninguno"/>
+          <w:rFonts w:ascii="Arial" w:hAnsi="Arial" w:hint="default"/>
+          <w:outline w:val="0"/>
+          <w:color w:val="000000"/>
+          <w:u w:color="000000"/>
+          <w:rtl w:val="0"/>
+          <w:lang w:val="es-ES_tradnl"/>
+          <w14:textFill>
+            <w14:solidFill>
+              <w14:srgbClr w14:val="000000"/>
+            </w14:solidFill>
+          </w14:textFill>
+        </w:rPr>
+        <w:t xml:space="preserve">1.</w:t>
+        <w:tab/>
+      </w:r>
+      <w:r>
+        <w:rPr>
+          <w:rStyle w:val="Ninguno"/>
+          <w:rFonts w:ascii="Arial" w:hAnsi="Arial" w:hint="default"/>
+          <w:outline w:val="0"/>
+          <w:color w:val="000000"/>
+          <w:u w:color="000000"/>
+          <w:rtl w:val="0"/>
+          <w:lang w:val="es-ES_tradnl"/>
+          <w14:textFill>
+            <w14:solidFill>
+              <w14:srgbClr w14:val="000000"/>
+            </w14:solidFill>
+          </w14:textFill>
+        </w:rPr>
+        <w:t xml:space="preserve">Cuando el empleado ficha la entrada o la salida, el sistema calcula la distancia entre su posición y la del cliente de su turno de hoy. Si ficha como sustituto, usa el cliente de la cobertura.</w:t>
+      </w:r>
+    </w:p>
+    <w:p>
+      <w:pPr>
+        <w:pStyle w:val="Cuerpo"/>
+        <w:tabs>
+          <w:tab w:val="left" w:pos="567"/>
+        </w:tabs>
+        <w:spacing w:after="60" w:line="330" w:lineRule="auto"/>
+        <w:ind w:left="567" w:hanging="283"/>
+        <w:jc w:val="both"/>
+      </w:pPr>
+      <w:r>
+        <w:rPr>
+          <w:rStyle w:val="Ninguno"/>
+          <w:rFonts w:ascii="Arial" w:hAnsi="Arial" w:hint="default"/>
+          <w:outline w:val="0"/>
+          <w:color w:val="000000"/>
+          <w:u w:color="000000"/>
+          <w:rtl w:val="0"/>
+          <w:lang w:val="es-ES_tradnl"/>
+          <w14:textFill>
+            <w14:solidFill>
+              <w14:srgbClr w14:val="000000"/>
+            </w14:solidFill>
+          </w14:textFill>
+        </w:rPr>
+        <w:t xml:space="preserve">2.</w:t>
+        <w:tab/>
+      </w:r>
+      <w:r>
+        <w:rPr>
+          <w:rStyle w:val="Ninguno"/>
+          <w:rFonts w:ascii="Arial" w:hAnsi="Arial" w:hint="default"/>
+          <w:outline w:val="0"/>
+          <w:color w:val="000000"/>
+          <w:u w:color="000000"/>
+          <w:rtl w:val="0"/>
+          <w:lang w:val="es-ES_tradnl"/>
+          <w14:textFill>
+            <w14:solidFill>
+              <w14:srgbClr w14:val="000000"/>
+            </w14:solidFill>
+          </w14:textFill>
+        </w:rPr>
+        <w:t xml:space="preserve">Si la distancia es menor o igual que el radio del cliente (150 m por defecto, configurable en radio_validacion_m), el estado es dentro.</w:t>
+      </w:r>
+    </w:p>
+    <w:p>
+      <w:pPr>
+        <w:pStyle w:val="Cuerpo"/>
+        <w:tabs>
+          <w:tab w:val="left" w:pos="567"/>
+        </w:tabs>
+        <w:spacing w:after="60" w:line="330" w:lineRule="auto"/>
+        <w:ind w:left="567" w:hanging="283"/>
+        <w:jc w:val="both"/>
+      </w:pPr>
+      <w:r>
+        <w:rPr>
+          <w:rStyle w:val="Ninguno"/>
+          <w:rFonts w:ascii="Arial" w:hAnsi="Arial" w:hint="default"/>
+          <w:outline w:val="0"/>
+          <w:color w:val="000000"/>
+          <w:u w:color="000000"/>
+          <w:rtl w:val="0"/>
+          <w:lang w:val="es-ES_tradnl"/>
+          <w14:textFill>
+            <w14:solidFill>
+              <w14:srgbClr w14:val="000000"/>
+            </w14:solidFill>
+          </w14:textFill>
+        </w:rPr>
+        <w:t xml:space="preserve">3.</w:t>
+        <w:tab/>
+      </w:r>
+      <w:r>
+        <w:rPr>
+          <w:rStyle w:val="Ninguno"/>
+          <w:rFonts w:ascii="Arial" w:hAnsi="Arial" w:hint="default"/>
+          <w:outline w:val="0"/>
+          <w:color w:val="000000"/>
+          <w:u w:color="000000"/>
+          <w:rtl w:val="0"/>
+          <w:lang w:val="es-ES_tradnl"/>
+          <w14:textFill>
+            <w14:solidFill>
+              <w14:srgbClr w14:val="000000"/>
+            </w14:solidFill>
+          </w14:textFill>
+        </w:rPr>
+        <w:t xml:space="preserve">Si la distancia supera el radio pero no el radio más la precisión que informa el GPS, el estado es dudoso.</w:t>
+      </w:r>
+    </w:p>
+    <w:p>
+      <w:pPr>
+        <w:pStyle w:val="Cuerpo"/>
+        <w:tabs>
+          <w:tab w:val="left" w:pos="567"/>
+        </w:tabs>
+        <w:spacing w:after="60" w:line="330" w:lineRule="auto"/>
+        <w:ind w:left="567" w:hanging="283"/>
+        <w:jc w:val="both"/>
+      </w:pPr>
+      <w:r>
+        <w:rPr>
+          <w:rStyle w:val="Ninguno"/>
+          <w:rFonts w:ascii="Arial" w:hAnsi="Arial" w:hint="default"/>
+          <w:outline w:val="0"/>
+          <w:color w:val="000000"/>
+          <w:u w:color="000000"/>
+          <w:rtl w:val="0"/>
+          <w:lang w:val="es-ES_tradnl"/>
+          <w14:textFill>
+            <w14:solidFill>
+              <w14:srgbClr w14:val="000000"/>
+            </w14:solidFill>
+          </w14:textFill>
+        </w:rPr>
+        <w:t xml:space="preserve">4.</w:t>
+        <w:tab/>
+      </w:r>
+      <w:r>
+        <w:rPr>
+          <w:rStyle w:val="Ninguno"/>
+          <w:rFonts w:ascii="Arial" w:hAnsi="Arial" w:hint="default"/>
+          <w:outline w:val="0"/>
+          <w:color w:val="000000"/>
+          <w:u w:color="000000"/>
+          <w:rtl w:val="0"/>
+          <w:lang w:val="es-ES_tradnl"/>
+          <w14:textFill>
+            <w14:solidFill>
+              <w14:srgbClr w14:val="000000"/>
+            </w14:solidFill>
+          </w14:textFill>
+        </w:rPr>
+        <w:t xml:space="preserve">Si la distancia supera el radio más la precisión, el estado es fuera.</w:t>
+      </w:r>
+    </w:p>
+    <w:p>
+      <w:pPr>
+        <w:pStyle w:val="Cuerpo"/>
+        <w:tabs>
+          <w:tab w:val="left" w:pos="567"/>
+        </w:tabs>
+        <w:spacing w:after="60" w:line="330" w:lineRule="auto"/>
+        <w:ind w:left="567" w:hanging="283"/>
+        <w:jc w:val="both"/>
+      </w:pPr>
+      <w:r>
+        <w:rPr>
+          <w:rStyle w:val="Ninguno"/>
+          <w:rFonts w:ascii="Arial" w:hAnsi="Arial" w:hint="default"/>
+          <w:outline w:val="0"/>
+          <w:color w:val="000000"/>
+          <w:u w:color="000000"/>
+          <w:rtl w:val="0"/>
+          <w:lang w:val="es-ES_tradnl"/>
+          <w14:textFill>
+            <w14:solidFill>
+              <w14:srgbClr w14:val="000000"/>
+            </w14:solidFill>
+          </w14:textFill>
+        </w:rPr>
+        <w:t xml:space="preserve">5.</w:t>
+        <w:tab/>
+      </w:r>
+      <w:r>
+        <w:rPr>
+          <w:rStyle w:val="Ninguno"/>
+          <w:rFonts w:ascii="Arial" w:hAnsi="Arial" w:hint="default"/>
+          <w:outline w:val="0"/>
+          <w:color w:val="000000"/>
+          <w:u w:color="000000"/>
+          <w:rtl w:val="0"/>
+          <w:lang w:val="es-ES_tradnl"/>
+          <w14:textFill>
+            <w14:solidFill>
+              <w14:srgbClr w14:val="000000"/>
+            </w14:solidFill>
+          </w14:textFill>
+        </w:rPr>
+        <w:t xml:space="preserve">Si la precisión es peor de 100 m o no llega, el estado nunca es dentro: es dudoso con el motivo precision_baja.</w:t>
+      </w:r>
+    </w:p>
+    <w:p>
+      <w:pPr>
+        <w:pStyle w:val="Cuerpo"/>
+        <w:tabs>
+          <w:tab w:val="left" w:pos="567"/>
+        </w:tabs>
+        <w:spacing w:after="60" w:line="330" w:lineRule="auto"/>
+        <w:ind w:left="567" w:hanging="283"/>
+        <w:jc w:val="both"/>
+      </w:pPr>
+      <w:r>
+        <w:rPr>
+          <w:rStyle w:val="Ninguno"/>
+          <w:rFonts w:ascii="Arial" w:hAnsi="Arial" w:hint="default"/>
+          <w:outline w:val="0"/>
+          <w:color w:val="000000"/>
+          <w:u w:color="000000"/>
+          <w:rtl w:val="0"/>
+          <w:lang w:val="es-ES_tradnl"/>
+          <w14:textFill>
+            <w14:solidFill>
+              <w14:srgbClr w14:val="000000"/>
+            </w14:solidFill>
+          </w14:textFill>
+        </w:rPr>
+        <w:t xml:space="preserve">6.</w:t>
+        <w:tab/>
+      </w:r>
+      <w:r>
+        <w:rPr>
+          <w:rStyle w:val="Ninguno"/>
+          <w:rFonts w:ascii="Arial" w:hAnsi="Arial" w:hint="default"/>
+          <w:outline w:val="0"/>
+          <w:color w:val="000000"/>
+          <w:u w:color="000000"/>
+          <w:rtl w:val="0"/>
+          <w:lang w:val="es-ES_tradnl"/>
+          <w14:textFill>
+            <w14:solidFill>
+              <w14:srgbClr w14:val="000000"/>
+            </w14:solidFill>
+          </w14:textFill>
+        </w:rPr>
+        <w:t xml:space="preserve">Si el turno es de furgoneta o el cliente no tiene coordenadas, el estado es sin_referencia.</w:t>
+      </w:r>
+    </w:p>
+    <w:p>
+      <w:pPr>
+        <w:pStyle w:val="Cuerpo"/>
+        <w:tabs>
+          <w:tab w:val="left" w:pos="567"/>
+        </w:tabs>
+        <w:spacing w:after="60" w:line="330" w:lineRule="auto"/>
+        <w:ind w:left="567" w:hanging="283"/>
+        <w:jc w:val="both"/>
+      </w:pPr>
+      <w:r>
+        <w:rPr>
+          <w:rStyle w:val="Ninguno"/>
+          <w:rFonts w:ascii="Arial" w:hAnsi="Arial" w:hint="default"/>
+          <w:outline w:val="0"/>
+          <w:color w:val="000000"/>
+          <w:u w:color="000000"/>
+          <w:rtl w:val="0"/>
+          <w:lang w:val="es-ES_tradnl"/>
+          <w14:textFill>
+            <w14:solidFill>
+              <w14:srgbClr w14:val="000000"/>
+            </w14:solidFill>
+          </w14:textFill>
+        </w:rPr>
+        <w:t xml:space="preserve">7.</w:t>
+        <w:tab/>
+      </w:r>
+      <w:r>
+        <w:rPr>
+          <w:rStyle w:val="Ninguno"/>
+          <w:rFonts w:ascii="Arial" w:hAnsi="Arial" w:hint="default"/>
+          <w:outline w:val="0"/>
+          <w:color w:val="000000"/>
+          <w:u w:color="000000"/>
+          <w:rtl w:val="0"/>
+          <w:lang w:val="es-ES_tradnl"/>
+          <w14:textFill>
+            <w14:solidFill>
+              <w14:srgbClr w14:val="000000"/>
+            </w14:solidFill>
+          </w14:textFill>
+        </w:rPr>
+        <w:t xml:space="preserve">Si el empleado tiene varios clientes en el día, se queda el mejor resultado (dentro mejor que dudoso y dudoso mejor que fuera).</w:t>
+      </w:r>
+    </w:p>
+    <w:p>
+      <w:pPr>
+        <w:pStyle w:val="Cuerpo"/>
+        <w:tabs>
+          <w:tab w:val="left" w:pos="567"/>
+        </w:tabs>
+        <w:spacing w:after="60" w:line="330" w:lineRule="auto"/>
+        <w:ind w:left="567" w:hanging="283"/>
+        <w:jc w:val="both"/>
+      </w:pPr>
+      <w:r>
+        <w:rPr>
+          <w:rStyle w:val="Ninguno"/>
+          <w:rFonts w:ascii="Arial" w:hAnsi="Arial" w:hint="default"/>
+          <w:outline w:val="0"/>
+          <w:color w:val="000000"/>
+          <w:u w:color="000000"/>
+          <w:rtl w:val="0"/>
+          <w:lang w:val="es-ES_tradnl"/>
+          <w14:textFill>
+            <w14:solidFill>
+              <w14:srgbClr w14:val="000000"/>
+            </w14:solidFill>
+          </w14:textFill>
+        </w:rPr>
+        <w:t xml:space="preserve">8.</w:t>
+        <w:tab/>
+      </w:r>
+      <w:r>
+        <w:rPr>
+          <w:rStyle w:val="Ninguno"/>
+          <w:rFonts w:ascii="Arial" w:hAnsi="Arial" w:hint="default"/>
+          <w:outline w:val="0"/>
+          <w:color w:val="000000"/>
+          <w:u w:color="000000"/>
+          <w:rtl w:val="0"/>
+          <w:lang w:val="es-ES_tradnl"/>
+          <w14:textFill>
+            <w14:solidFill>
+              <w14:srgbClr w14:val="000000"/>
+            </w14:solidFill>
+          </w14:textFill>
+        </w:rPr>
+        <w:t xml:space="preserve">En cualquier estado, el fichaje se guarda.</w:t>
+      </w:r>
+    </w:p>
+    <w:p>
+      <w:pPr>
+        <w:pStyle w:val="Cuerpo"/>
+        <w:spacing w:line="360" w:lineRule="auto"/>
+        <w:jc w:val="both"/>
+      </w:pPr>
+      <w:r>
+        <w:rPr>
+          <w:rStyle w:val="Ninguno"/>
+          <w:rFonts w:ascii="Arial" w:hAnsi="Arial" w:hint="default"/>
+          <w:b w:val="1"/>
+          <w:bCs w:val="1"/>
+          <w:outline w:val="0"/>
+          <w:color w:val="000000"/>
+          <w:u w:color="000000"/>
+          <w:rtl w:val="0"/>
+          <w:lang w:val="es-ES_tradnl"/>
+          <w14:textFill>
+            <w14:solidFill>
+              <w14:srgbClr w14:val="000000"/>
+            </w14:solidFill>
+          </w14:textFill>
+        </w:rPr>
+        <w:t xml:space="preserve">Casos límite con un radio de 150 m. </w:t>
+      </w:r>
+      <w:r>
+        <w:rPr>
+          <w:rStyle w:val="Ninguno"/>
+          <w:rFonts w:ascii="Arial" w:hAnsi="Arial" w:hint="default"/>
+          <w:outline w:val="0"/>
+          <w:color w:val="000000"/>
+          <w:u w:color="000000"/>
+          <w:rtl w:val="0"/>
+          <w:lang w:val="es-ES_tradnl"/>
+          <w14:textFill>
+            <w14:solidFill>
+              <w14:srgbClr w14:val="000000"/>
+            </w14:solidFill>
+          </w14:textFill>
+        </w:rPr>
+        <w:t xml:space="preserve">149 m con precisión de 5 m es dentro. 151 m con 5 m es dudoso, porque 151 es menor que 150 + 5. 160 m con 5 m es fuera. 160 m con 30 m es dudoso. 10 m con 300 m de precisión es dudoso (precision_baja) aunque esté casi en el punto, porque con esa precisión no se puede asegurar que esté dentro.</w:t>
+      </w:r>
+    </w:p>
+    <w:p>
+      <w:pPr>
+        <w:pStyle w:val="Cuerpo"/>
+        <w:spacing w:line="360" w:lineRule="auto"/>
+        <w:jc w:val="both"/>
+      </w:pPr>
+      <w:r>
+        <w:rPr>
+          <w:rStyle w:val="Ninguno"/>
+          <w:rFonts w:ascii="Arial" w:hAnsi="Arial" w:hint="default"/>
+          <w:b w:val="1"/>
+          <w:bCs w:val="1"/>
+          <w:outline w:val="0"/>
+          <w:color w:val="000000"/>
+          <w:u w:color="000000"/>
+          <w:rtl w:val="0"/>
+          <w:lang w:val="es-ES_tradnl"/>
+          <w14:textFill>
+            <w14:solidFill>
+              <w14:srgbClr w14:val="000000"/>
+            </w14:solidFill>
+          </w14:textFill>
+        </w:rPr>
+        <w:t xml:space="preserve">Cómo se construye. </w:t>
+      </w:r>
+      <w:r>
+        <w:rPr>
+          <w:rStyle w:val="Ninguno"/>
+          <w:rFonts w:ascii="Arial" w:hAnsi="Arial" w:hint="default"/>
+          <w:outline w:val="0"/>
+          <w:color w:val="000000"/>
+          <w:u w:color="000000"/>
+          <w:rtl w:val="0"/>
+          <w:lang w:val="es-ES_tradnl"/>
+          <w14:textFill>
+            <w14:solidFill>
+              <w14:srgbClr w14:val="000000"/>
+            </w14:solidFill>
+          </w14:textFill>
+        </w:rPr>
+        <w:t xml:space="preserve">validarUbicacion es una función pura de src/utils: recibe la posición y los clientes de referencia y devuelve el estado, la distancia, el radio y el motivo, sin acceder a la base de datos. Por eso se prueba con node:test sin levantar el servidor. Las rutas de entrada y de salida la llaman y guardan el resultado en el campo validacion de cada punto del fichaje.</w:t>
+      </w:r>
+    </w:p>
+    <w:p>
+      <w:pPr>
+        <w:pStyle w:val="Cuerpo"/>
+        <w:keepNext w:val="1"/>
+        <w:spacing w:before="120" w:after="80" w:line="360" w:lineRule="auto"/>
+        <w:outlineLvl w:val="2"/>
+      </w:pPr>
+      <w:r>
+        <w:rPr>
+          <w:rStyle w:val="Ninguno"/>
+          <w:rFonts w:ascii="Arial" w:hAnsi="Arial"/>
+          <w:b w:val="1"/>
+          <w:bCs w:val="1"/>
+          <w:i w:val="1"/>
+          <w:iCs w:val="1"/>
+          <w:outline w:val="0"/>
+          <w:color w:val="000000"/>
+          <w:sz w:val="23"/>
+          <w:szCs w:val="23"/>
+          <w:u w:color="000000"/>
+          <w:rtl w:val="0"/>
+          <w:lang w:val="es-ES_tradnl"/>
+          <w14:textFill>
+            <w14:solidFill>
+              <w14:srgbClr w14:val="000000"/>
+            </w14:solidFill>
+          </w14:textFill>
+        </w:rPr>
+        <w:t>Detección de ubicación falsa</w:t>
+      </w:r>
+    </w:p>
+    <w:p>
+      <w:pPr>
+        <w:pStyle w:val="Cuerpo"/>
+        <w:spacing w:line="360" w:lineRule="auto"/>
+        <w:jc w:val="both"/>
+      </w:pPr>
+      <w:r>
+        <w:rPr>
+          <w:rStyle w:val="Ninguno"/>
+          <w:rFonts w:ascii="Arial" w:hAnsi="Arial" w:hint="default"/>
+          <w:outline w:val="0"/>
+          <w:color w:val="000000"/>
+          <w:u w:color="000000"/>
+          <w:rtl w:val="0"/>
+          <w:lang w:val="es-ES_tradnl"/>
+          <w14:textFill>
+            <w14:solidFill>
+              <w14:srgbClr w14:val="000000"/>
+            </w14:solidFill>
+          </w14:textFill>
+        </w:rPr>
+        <w:t xml:space="preserve">Además del estado, el servidor busca indicios de que la posición no es real y los guarda en validacion.sospecha, con un nivel (ninguna, baja o alta) y la lista de motivos:</w:t>
+      </w:r>
+    </w:p>
+    <w:p>
+      <w:pPr>
+        <w:pStyle w:val="Cuerpo"/>
+        <w:tabs>
+          <w:tab w:val="left" w:pos="567"/>
+        </w:tabs>
+        <w:spacing w:after="60" w:line="330" w:lineRule="auto"/>
+        <w:ind w:left="567" w:hanging="283"/>
+        <w:jc w:val="both"/>
+      </w:pPr>
+      <w:r>
+        <w:rPr>
+          <w:rStyle w:val="Ninguno"/>
+          <w:rFonts w:ascii="Arial" w:hAnsi="Arial" w:hint="default"/>
+          <w:outline w:val="0"/>
+          <w:color w:val="000000"/>
+          <w:u w:color="000000"/>
+          <w:rtl w:val="0"/>
+          <w:lang w:val="es-ES_tradnl"/>
+          <w14:textFill>
+            <w14:solidFill>
+              <w14:srgbClr w14:val="000000"/>
+            </w14:solidFill>
+          </w14:textFill>
+        </w:rPr>
+        <w:t xml:space="preserve">•</w:t>
+        <w:tab/>
+      </w:r>
+      <w:r>
+        <w:rPr>
+          <w:rStyle w:val="Ninguno"/>
+          <w:rFonts w:ascii="Arial" w:hAnsi="Arial" w:hint="default"/>
+          <w:b w:val="1"/>
+          <w:bCs w:val="1"/>
+          <w:outline w:val="0"/>
+          <w:color w:val="000000"/>
+          <w:u w:color="000000"/>
+          <w:rtl w:val="0"/>
+          <w:lang w:val="es-ES_tradnl"/>
+          <w14:textFill>
+            <w14:solidFill>
+              <w14:srgbClr w14:val="000000"/>
+            </w14:solidFill>
+          </w14:textFill>
+        </w:rPr>
+        <w:t xml:space="preserve">Viaje imposible: </w:t>
+      </w:r>
+      <w:r>
+        <w:rPr>
+          <w:rStyle w:val="Ninguno"/>
+          <w:rFonts w:ascii="Arial" w:hAnsi="Arial" w:hint="default"/>
+          <w:outline w:val="0"/>
+          <w:color w:val="000000"/>
+          <w:u w:color="000000"/>
+          <w:rtl w:val="0"/>
+          <w:lang w:val="es-ES_tradnl"/>
+          <w14:textFill>
+            <w14:solidFill>
+              <w14:srgbClr w14:val="000000"/>
+            </w14:solidFill>
+          </w14:textFill>
+        </w:rPr>
+        <w:t xml:space="preserve">la velocidad necesaria entre dos fichajes consecutivos del empleado supera los 150 km/h.</w:t>
+      </w:r>
+    </w:p>
+    <w:p>
+      <w:pPr>
+        <w:pStyle w:val="Cuerpo"/>
+        <w:tabs>
+          <w:tab w:val="left" w:pos="567"/>
+        </w:tabs>
+        <w:spacing w:after="60" w:line="330" w:lineRule="auto"/>
+        <w:ind w:left="567" w:hanging="283"/>
+        <w:jc w:val="both"/>
+      </w:pPr>
+      <w:r>
+        <w:rPr>
+          <w:rStyle w:val="Ninguno"/>
+          <w:rFonts w:ascii="Arial" w:hAnsi="Arial" w:hint="default"/>
+          <w:outline w:val="0"/>
+          <w:color w:val="000000"/>
+          <w:u w:color="000000"/>
+          <w:rtl w:val="0"/>
+          <w:lang w:val="es-ES_tradnl"/>
+          <w14:textFill>
+            <w14:solidFill>
+              <w14:srgbClr w14:val="000000"/>
+            </w14:solidFill>
+          </w14:textFill>
+        </w:rPr>
+        <w:t xml:space="preserve">•</w:t>
+        <w:tab/>
+      </w:r>
+      <w:r>
+        <w:rPr>
+          <w:rStyle w:val="Ninguno"/>
+          <w:rFonts w:ascii="Arial" w:hAnsi="Arial" w:hint="default"/>
+          <w:b w:val="1"/>
+          <w:bCs w:val="1"/>
+          <w:outline w:val="0"/>
+          <w:color w:val="000000"/>
+          <w:u w:color="000000"/>
+          <w:rtl w:val="0"/>
+          <w:lang w:val="es-ES_tradnl"/>
+          <w14:textFill>
+            <w14:solidFill>
+              <w14:srgbClr w14:val="000000"/>
+            </w14:solidFill>
+          </w14:textFill>
+        </w:rPr>
+        <w:t xml:space="preserve">Posición antigua: </w:t>
+      </w:r>
+      <w:r>
+        <w:rPr>
+          <w:rStyle w:val="Ninguno"/>
+          <w:rFonts w:ascii="Arial" w:hAnsi="Arial" w:hint="default"/>
+          <w:outline w:val="0"/>
+          <w:color w:val="000000"/>
+          <w:u w:color="000000"/>
+          <w:rtl w:val="0"/>
+          <w:lang w:val="es-ES_tradnl"/>
+          <w14:textFill>
+            <w14:solidFill>
+              <w14:srgbClr w14:val="000000"/>
+            </w14:solidFill>
+          </w14:textFill>
+        </w:rPr>
+        <w:t xml:space="preserve">la marca de tiempo de la posición se aleja más de 60 s de la hora del servidor.</w:t>
+      </w:r>
+    </w:p>
+    <w:p>
+      <w:pPr>
+        <w:pStyle w:val="Cuerpo"/>
+        <w:tabs>
+          <w:tab w:val="left" w:pos="567"/>
+        </w:tabs>
+        <w:spacing w:after="60" w:line="330" w:lineRule="auto"/>
+        <w:ind w:left="567" w:hanging="283"/>
+        <w:jc w:val="both"/>
+      </w:pPr>
+      <w:r>
+        <w:rPr>
+          <w:rStyle w:val="Ninguno"/>
+          <w:rFonts w:ascii="Arial" w:hAnsi="Arial" w:hint="default"/>
+          <w:outline w:val="0"/>
+          <w:color w:val="000000"/>
+          <w:u w:color="000000"/>
+          <w:rtl w:val="0"/>
+          <w:lang w:val="es-ES_tradnl"/>
+          <w14:textFill>
+            <w14:solidFill>
+              <w14:srgbClr w14:val="000000"/>
+            </w14:solidFill>
+          </w14:textFill>
+        </w:rPr>
+        <w:t xml:space="preserve">•</w:t>
+        <w:tab/>
+      </w:r>
+      <w:r>
+        <w:rPr>
+          <w:rStyle w:val="Ninguno"/>
+          <w:rFonts w:ascii="Arial" w:hAnsi="Arial" w:hint="default"/>
+          <w:b w:val="1"/>
+          <w:bCs w:val="1"/>
+          <w:outline w:val="0"/>
+          <w:color w:val="000000"/>
+          <w:u w:color="000000"/>
+          <w:rtl w:val="0"/>
+          <w:lang w:val="es-ES_tradnl"/>
+          <w14:textFill>
+            <w14:solidFill>
+              <w14:srgbClr w14:val="000000"/>
+            </w14:solidFill>
+          </w14:textFill>
+        </w:rPr>
+        <w:t xml:space="preserve">Coordenadas idénticas: </w:t>
+      </w:r>
+      <w:r>
+        <w:rPr>
+          <w:rStyle w:val="Ninguno"/>
+          <w:rFonts w:ascii="Arial" w:hAnsi="Arial" w:hint="default"/>
+          <w:outline w:val="0"/>
+          <w:color w:val="000000"/>
+          <w:u w:color="000000"/>
+          <w:rtl w:val="0"/>
+          <w:lang w:val="es-ES_tradnl"/>
+          <w14:textFill>
+            <w14:solidFill>
+              <w14:srgbClr w14:val="000000"/>
+            </w14:solidFill>
+          </w14:textFill>
+        </w:rPr>
+        <w:t xml:space="preserve">dos fichajes con las mismas coordenadas a seis decimales, algo muy raro con un GPS real.</w:t>
+      </w:r>
+    </w:p>
+    <w:p>
+      <w:pPr>
+        <w:pStyle w:val="Cuerpo"/>
+        <w:tabs>
+          <w:tab w:val="left" w:pos="567"/>
+        </w:tabs>
+        <w:spacing w:after="60" w:line="330" w:lineRule="auto"/>
+        <w:ind w:left="567" w:hanging="283"/>
+        <w:jc w:val="both"/>
+      </w:pPr>
+      <w:r>
+        <w:rPr>
+          <w:rStyle w:val="Ninguno"/>
+          <w:rFonts w:ascii="Arial" w:hAnsi="Arial" w:hint="default"/>
+          <w:outline w:val="0"/>
+          <w:color w:val="000000"/>
+          <w:u w:color="000000"/>
+          <w:rtl w:val="0"/>
+          <w:lang w:val="es-ES_tradnl"/>
+          <w14:textFill>
+            <w14:solidFill>
+              <w14:srgbClr w14:val="000000"/>
+            </w14:solidFill>
+          </w14:textFill>
+        </w:rPr>
+        <w:t xml:space="preserve">•</w:t>
+        <w:tab/>
+      </w:r>
+      <w:r>
+        <w:rPr>
+          <w:rStyle w:val="Ninguno"/>
+          <w:rFonts w:ascii="Arial" w:hAnsi="Arial" w:hint="default"/>
+          <w:b w:val="1"/>
+          <w:bCs w:val="1"/>
+          <w:outline w:val="0"/>
+          <w:color w:val="000000"/>
+          <w:u w:color="000000"/>
+          <w:rtl w:val="0"/>
+          <w:lang w:val="es-ES_tradnl"/>
+          <w14:textFill>
+            <w14:solidFill>
+              <w14:srgbClr w14:val="000000"/>
+            </w14:solidFill>
+          </w14:textFill>
+        </w:rPr>
+        <w:t xml:space="preserve">Precisión artificial: </w:t>
+      </w:r>
+      <w:r>
+        <w:rPr>
+          <w:rStyle w:val="Ninguno"/>
+          <w:rFonts w:ascii="Arial" w:hAnsi="Arial" w:hint="default"/>
+          <w:outline w:val="0"/>
+          <w:color w:val="000000"/>
+          <w:u w:color="000000"/>
+          <w:rtl w:val="0"/>
+          <w:lang w:val="es-ES_tradnl"/>
+          <w14:textFill>
+            <w14:solidFill>
+              <w14:srgbClr w14:val="000000"/>
+            </w14:solidFill>
+          </w14:textFill>
+        </w:rPr>
+        <w:t xml:space="preserve">precisión de 0 o 1 m, constante entre fichajes, o ausencia de altitud y velocidad, que los GPS reales suelen enviar.</w:t>
+      </w:r>
+    </w:p>
+    <w:p>
+      <w:pPr>
+        <w:pStyle w:val="Cuerpo"/>
+        <w:tabs>
+          <w:tab w:val="left" w:pos="567"/>
+        </w:tabs>
+        <w:spacing w:after="60" w:line="330" w:lineRule="auto"/>
+        <w:ind w:left="567" w:hanging="283"/>
+        <w:jc w:val="both"/>
+      </w:pPr>
+      <w:r>
+        <w:rPr>
+          <w:rStyle w:val="Ninguno"/>
+          <w:rFonts w:ascii="Arial" w:hAnsi="Arial" w:hint="default"/>
+          <w:outline w:val="0"/>
+          <w:color w:val="000000"/>
+          <w:u w:color="000000"/>
+          <w:rtl w:val="0"/>
+          <w:lang w:val="es-ES_tradnl"/>
+          <w14:textFill>
+            <w14:solidFill>
+              <w14:srgbClr w14:val="000000"/>
+            </w14:solidFill>
+          </w14:textFill>
+        </w:rPr>
+        <w:t xml:space="preserve">•</w:t>
+        <w:tab/>
+      </w:r>
+      <w:r>
+        <w:rPr>
+          <w:rStyle w:val="Ninguno"/>
+          <w:rFonts w:ascii="Arial" w:hAnsi="Arial" w:hint="default"/>
+          <w:b w:val="1"/>
+          <w:bCs w:val="1"/>
+          <w:outline w:val="0"/>
+          <w:color w:val="000000"/>
+          <w:u w:color="000000"/>
+          <w:rtl w:val="0"/>
+          <w:lang w:val="es-ES_tradnl"/>
+          <w14:textFill>
+            <w14:solidFill>
+              <w14:srgbClr w14:val="000000"/>
+            </w14:solidFill>
+          </w14:textFill>
+        </w:rPr>
+        <w:t xml:space="preserve">Cambio de dispositivo: </w:t>
+      </w:r>
+      <w:r>
+        <w:rPr>
+          <w:rStyle w:val="Ninguno"/>
+          <w:rFonts w:ascii="Arial" w:hAnsi="Arial" w:hint="default"/>
+          <w:outline w:val="0"/>
+          <w:color w:val="000000"/>
+          <w:u w:color="000000"/>
+          <w:rtl w:val="0"/>
+          <w:lang w:val="es-ES_tradnl"/>
+          <w14:textFill>
+            <w14:solidFill>
+              <w14:srgbClr w14:val="000000"/>
+            </w14:solidFill>
+          </w14:textFill>
+        </w:rPr>
+        <w:t xml:space="preserve">el fichaje llega de un dispositivo distinto al habitual del empleado.</w:t>
+      </w:r>
+    </w:p>
+    <w:p>
+      <w:pPr>
+        <w:pStyle w:val="Cuerpo"/>
+        <w:spacing w:line="360" w:lineRule="auto"/>
+        <w:jc w:val="both"/>
+      </w:pPr>
+      <w:r>
+        <w:rPr>
+          <w:rStyle w:val="Ninguno"/>
+          <w:rFonts w:ascii="Arial" w:hAnsi="Arial" w:hint="default"/>
+          <w:outline w:val="0"/>
+          <w:color w:val="000000"/>
+          <w:u w:color="000000"/>
+          <w:rtl w:val="0"/>
+          <w:lang w:val="es-ES_tradnl"/>
+          <w14:textFill>
+            <w14:solidFill>
+              <w14:srgbClr w14:val="000000"/>
+            </w14:solidFill>
+          </w14:textFill>
+        </w:rPr>
+        <w:t xml:space="preserve">El nivel es alta si hay viaje imposible o dos o más señales, y baja si hay una sola. </w:t>
+      </w:r>
+      <w:r>
+        <w:rPr>
+          <w:rStyle w:val="Ninguno"/>
+          <w:rFonts w:ascii="Arial" w:hAnsi="Arial" w:hint="default"/>
+          <w:b w:val="1"/>
+          <w:bCs w:val="1"/>
+          <w:outline w:val="0"/>
+          <w:color w:val="000000"/>
+          <w:u w:color="000000"/>
+          <w:rtl w:val="0"/>
+          <w:lang w:val="es-ES_tradnl"/>
+          <w14:textFill>
+            <w14:solidFill>
+              <w14:srgbClr w14:val="000000"/>
+            </w14:solidFill>
+          </w14:textFill>
+        </w:rPr>
+        <w:t xml:space="preserve">Límite. </w:t>
+      </w:r>
+      <w:r>
+        <w:rPr>
+          <w:rStyle w:val="Ninguno"/>
+          <w:rFonts w:ascii="Arial" w:hAnsi="Arial" w:hint="default"/>
+          <w:outline w:val="0"/>
+          <w:color w:val="000000"/>
+          <w:u w:color="000000"/>
+          <w:rtl w:val="0"/>
+          <w:lang w:val="es-ES_tradnl"/>
+          <w14:textFill>
+            <w14:solidFill>
+              <w14:srgbClr w14:val="000000"/>
+            </w14:solidFill>
+          </w14:textFill>
+        </w:rPr>
+        <w:t xml:space="preserve">Una página web no puede saber con certeza si el móvil usa una ubicación simulada, porque el navegador no expone esa información. Por eso estas señales son indicios que se muestran a la administración, no una prueba, y tampoco bloquean el fichaje.</w:t>
       </w:r>
     </w:p>
     <w:p>
@@ -37726,279 +39203,38 @@
       <w:r>
         <w:rPr>
           <w:rStyle w:val="Ninguno"/>
-          <w:rFonts w:ascii="Arial" w:hAnsi="Arial"/>
+          <w:rFonts w:ascii="Arial" w:hAnsi="Arial" w:hint="default"/>
           <w:b w:val="1"/>
           <w:bCs w:val="1"/>
           <w:outline w:val="0"/>
           <w:color w:val="000000"/>
           <w:u w:color="000000"/>
           <w:rtl w:val="0"/>
-          <w14:textFill>
-            <w14:solidFill>
-              <w14:srgbClr w14:val="000000"/>
-            </w14:solidFill>
-          </w14:textFill>
-        </w:rPr>
-        <w:t>M</w:t>
-      </w:r>
-      <w:r>
-        <w:rPr>
-          <w:rStyle w:val="Ninguno"/>
-          <w:rFonts w:ascii="Arial" w:hAnsi="Arial" w:hint="default"/>
-          <w:b w:val="1"/>
-          <w:bCs w:val="1"/>
-          <w:outline w:val="0"/>
-          <w:color w:val="000000"/>
-          <w:u w:color="000000"/>
-          <w:rtl w:val="0"/>
-          <w:lang w:val="es-ES_tradnl"/>
-          <w14:textFill>
-            <w14:solidFill>
-              <w14:srgbClr w14:val="000000"/>
-            </w14:solidFill>
-          </w14:textFill>
-        </w:rPr>
-        <w:t>é</w:t>
-      </w:r>
-      <w:r>
-        <w:rPr>
-          <w:rStyle w:val="Ninguno"/>
-          <w:rFonts w:ascii="Arial" w:hAnsi="Arial"/>
-          <w:b w:val="1"/>
-          <w:bCs w:val="1"/>
-          <w:outline w:val="0"/>
-          <w:color w:val="000000"/>
-          <w:u w:color="000000"/>
-          <w:rtl w:val="0"/>
-          <w:lang w:val="es-ES_tradnl"/>
-          <w14:textFill>
-            <w14:solidFill>
-              <w14:srgbClr w14:val="000000"/>
-            </w14:solidFill>
-          </w14:textFill>
-        </w:rPr>
-        <w:t xml:space="preserve">todo de trabajo. </w:t>
-      </w:r>
-      <w:r>
-        <w:rPr>
-          <w:rStyle w:val="Ninguno"/>
-          <w:rFonts w:ascii="Arial" w:hAnsi="Arial"/>
-          <w:outline w:val="0"/>
-          <w:color w:val="000000"/>
-          <w:u w:color="000000"/>
-          <w:rtl w:val="0"/>
-          <w:lang w:val="pt-PT"/>
-          <w14:textFill>
-            <w14:solidFill>
-              <w14:srgbClr w14:val="000000"/>
-            </w14:solidFill>
-          </w14:textFill>
-        </w:rPr>
-        <w:t xml:space="preserve">Para </w:t>
-      </w:r>
-      <w:r>
-        <w:rPr>
-          <w:rStyle w:val="Ninguno"/>
-          <w:rFonts w:ascii="Arial" w:hAnsi="Arial"/>
-          <w:outline w:val="0"/>
-          <w:color w:val="000000"/>
-          <w:u w:color="000000"/>
-          <w:rtl w:val="0"/>
-          <w:lang w:val="es-ES_tradnl"/>
-          <w14:textFill>
-            <w14:solidFill>
-              <w14:srgbClr w14:val="000000"/>
-            </w14:solidFill>
-          </w14:textFill>
-        </w:rPr>
-        <w:t>el desarrollo actual del proyecto</w:t>
-      </w:r>
-      <w:r>
-        <w:rPr>
-          <w:rStyle w:val="Ninguno"/>
-          <w:rFonts w:ascii="Arial" w:hAnsi="Arial"/>
-          <w:outline w:val="0"/>
-          <w:color w:val="000000"/>
-          <w:u w:color="000000"/>
-          <w:rtl w:val="0"/>
-          <w:lang w:val="es-ES_tradnl"/>
-          <w14:textFill>
-            <w14:solidFill>
-              <w14:srgbClr w14:val="000000"/>
-            </w14:solidFill>
-          </w14:textFill>
-        </w:rPr>
-        <w:t xml:space="preserve"> sigo un desarrollo guiado por especificaciones (Spec-Driven Development): primero escribo las reglas del proyecto, la especificaci</w:t>
-      </w:r>
-      <w:r>
-        <w:rPr>
-          <w:rStyle w:val="Ninguno"/>
-          <w:rFonts w:ascii="Arial" w:hAnsi="Arial" w:hint="default"/>
-          <w:outline w:val="0"/>
-          <w:color w:val="000000"/>
-          <w:u w:color="000000"/>
-          <w:rtl w:val="0"/>
-          <w:lang w:val="es-ES_tradnl"/>
-          <w14:textFill>
-            <w14:solidFill>
-              <w14:srgbClr w14:val="000000"/>
-            </w14:solidFill>
-          </w14:textFill>
-        </w:rPr>
-        <w:t>ó</w:t>
-      </w:r>
-      <w:r>
-        <w:rPr>
-          <w:rStyle w:val="Ninguno"/>
-          <w:rFonts w:ascii="Arial" w:hAnsi="Arial"/>
-          <w:outline w:val="0"/>
-          <w:color w:val="000000"/>
-          <w:u w:color="000000"/>
-          <w:rtl w:val="0"/>
-          <w:lang w:val="es-ES_tradnl"/>
-          <w14:textFill>
-            <w14:solidFill>
-              <w14:srgbClr w14:val="000000"/>
-            </w14:solidFill>
-          </w14:textFill>
-        </w:rPr>
-        <w:t>n de los requisitos y el plan t</w:t>
-      </w:r>
-      <w:r>
-        <w:rPr>
-          <w:rStyle w:val="Ninguno"/>
-          <w:rFonts w:ascii="Arial" w:hAnsi="Arial" w:hint="default"/>
-          <w:outline w:val="0"/>
-          <w:color w:val="000000"/>
-          <w:u w:color="000000"/>
-          <w:rtl w:val="0"/>
-          <w:lang w:val="es-ES_tradnl"/>
-          <w14:textFill>
-            <w14:solidFill>
-              <w14:srgbClr w14:val="000000"/>
-            </w14:solidFill>
-          </w14:textFill>
-        </w:rPr>
-        <w:t>é</w:t>
-      </w:r>
-      <w:r>
-        <w:rPr>
-          <w:rStyle w:val="Ninguno"/>
-          <w:rFonts w:ascii="Arial" w:hAnsi="Arial"/>
-          <w:outline w:val="0"/>
-          <w:color w:val="000000"/>
-          <w:u w:color="000000"/>
-          <w:rtl w:val="0"/>
-          <w:lang w:val="es-ES_tradnl"/>
-          <w14:textFill>
-            <w14:solidFill>
-              <w14:srgbClr w14:val="000000"/>
-            </w14:solidFill>
-          </w14:textFill>
-        </w:rPr>
-        <w:t>cnico; despu</w:t>
-      </w:r>
-      <w:r>
-        <w:rPr>
-          <w:rStyle w:val="Ninguno"/>
-          <w:rFonts w:ascii="Arial" w:hAnsi="Arial" w:hint="default"/>
-          <w:outline w:val="0"/>
-          <w:color w:val="000000"/>
-          <w:u w:color="000000"/>
-          <w:rtl w:val="0"/>
-          <w:lang w:val="es-ES_tradnl"/>
-          <w14:textFill>
-            <w14:solidFill>
-              <w14:srgbClr w14:val="000000"/>
-            </w14:solidFill>
-          </w14:textFill>
-        </w:rPr>
-        <w:t>é</w:t>
-      </w:r>
-      <w:r>
-        <w:rPr>
-          <w:rStyle w:val="Ninguno"/>
-          <w:rFonts w:ascii="Arial" w:hAnsi="Arial"/>
-          <w:outline w:val="0"/>
-          <w:color w:val="000000"/>
-          <w:u w:color="000000"/>
-          <w:rtl w:val="0"/>
-          <w:lang w:val="es-ES_tradnl"/>
-          <w14:textFill>
-            <w14:solidFill>
-              <w14:srgbClr w14:val="000000"/>
-            </w14:solidFill>
-          </w14:textFill>
-        </w:rPr>
-        <w:t>s se desglosa en tareas peque</w:t>
-      </w:r>
-      <w:r>
-        <w:rPr>
-          <w:rStyle w:val="Ninguno"/>
-          <w:rFonts w:ascii="Arial" w:hAnsi="Arial" w:hint="default"/>
-          <w:outline w:val="0"/>
-          <w:color w:val="000000"/>
-          <w:u w:color="000000"/>
-          <w:rtl w:val="0"/>
-          <w:lang w:val="es-ES_tradnl"/>
-          <w14:textFill>
-            <w14:solidFill>
-              <w14:srgbClr w14:val="000000"/>
-            </w14:solidFill>
-          </w14:textFill>
-        </w:rPr>
-        <w:t>ñ</w:t>
-      </w:r>
-      <w:r>
-        <w:rPr>
-          <w:rStyle w:val="Ninguno"/>
-          <w:rFonts w:ascii="Arial" w:hAnsi="Arial"/>
-          <w:outline w:val="0"/>
-          <w:color w:val="000000"/>
-          <w:u w:color="000000"/>
-          <w:rtl w:val="0"/>
-          <w:lang w:val="es-ES_tradnl"/>
-          <w14:textFill>
-            <w14:solidFill>
-              <w14:srgbClr w14:val="000000"/>
-            </w14:solidFill>
-          </w14:textFill>
-        </w:rPr>
-        <w:t>as, cada una con su commit, y se implementa con las pruebas escritas antes que el c</w:t>
-      </w:r>
-      <w:r>
-        <w:rPr>
-          <w:rStyle w:val="Ninguno"/>
-          <w:rFonts w:ascii="Arial" w:hAnsi="Arial" w:hint="default"/>
-          <w:outline w:val="0"/>
-          <w:color w:val="000000"/>
-          <w:u w:color="000000"/>
-          <w:rtl w:val="0"/>
-          <w:lang w:val="es-ES_tradnl"/>
-          <w14:textFill>
-            <w14:solidFill>
-              <w14:srgbClr w14:val="000000"/>
-            </w14:solidFill>
-          </w14:textFill>
-        </w:rPr>
-        <w:t>ó</w:t>
-      </w:r>
-      <w:r>
-        <w:rPr>
-          <w:rStyle w:val="Ninguno"/>
-          <w:rFonts w:ascii="Arial" w:hAnsi="Arial"/>
-          <w:outline w:val="0"/>
-          <w:color w:val="000000"/>
-          <w:u w:color="000000"/>
-          <w:rtl w:val="0"/>
-          <w:lang w:val="pt-PT"/>
-          <w14:textFill>
-            <w14:solidFill>
-              <w14:srgbClr w14:val="000000"/>
-            </w14:solidFill>
-          </w14:textFill>
-        </w:rPr>
-        <w:t>digo.</w:t>
+          <w:lang w:val="es-ES_tradnl"/>
+          <w14:textFill>
+            <w14:solidFill>
+              <w14:srgbClr w14:val="000000"/>
+            </w14:solidFill>
+          </w14:textFill>
+        </w:rPr>
+        <w:t xml:space="preserve">Método de trabajo. </w:t>
+      </w:r>
+      <w:r>
+        <w:rPr>
+          <w:rStyle w:val="Ninguno"/>
+          <w:rFonts w:ascii="Arial" w:hAnsi="Arial" w:hint="default"/>
+          <w:outline w:val="0"/>
+          <w:color w:val="000000"/>
+          <w:u w:color="000000"/>
+          <w:rtl w:val="0"/>
+          <w:lang w:val="es-ES_tradnl"/>
+          <w14:textFill>
+            <w14:solidFill>
+              <w14:srgbClr w14:val="000000"/>
+            </w14:solidFill>
+          </w14:textFill>
+        </w:rPr>
+        <w:t xml:space="preserve">Sigo una versión sencilla del desarrollo guiado por especificaciones (Spec-Driven Development): la especificación de cada función está en esta memoria, en los requisitos RFTP del apartado de objetivos y en las reglas de negocio del apartado de descripción, y no en una carpeta aparte del repositorio. A partir de ella se desglosa el trabajo en tareas pequeñas, cada una con su commit, y se implementa escribiendo antes las pruebas que el código.</w:t>
       </w:r>
     </w:p>
     <w:p>

</xml_diff>